<commit_message>
lab 3 opd report done
</commit_message>
<xml_diff>
--- a/1 opd/lab/lab2/Отчет.docx
+++ b/1 opd/lab/lab2/Отчет.docx
@@ -2453,16 +2453,7 @@
           <w:szCs w:val="28"/>
           <w:lang w:val="en-US"/>
         </w:rPr>
-        <w:t>&gt; -2^14</w:t>
-      </w:r>
-      <w:r>
-        <w:rPr>
-          <w:rFonts w:ascii="Times New Roman" w:hAnsi="Times New Roman" w:cs="Times New Roman"/>
-          <w:sz w:val="28"/>
-          <w:szCs w:val="28"/>
-          <w:lang w:val="en-US"/>
-        </w:rPr>
-        <w:t>,</w:t>
+        <w:t>&gt; -2^14,</w:t>
       </w:r>
       <w:r>
         <w:rPr>
@@ -4399,16 +4390,7 @@
                 <w:szCs w:val="28"/>
                 <w:lang w:val="en-US"/>
               </w:rPr>
-              <w:t>13</w:t>
-            </w:r>
-            <w:r>
-              <w:rPr>
-                <w:rFonts w:ascii="Times New Roman" w:hAnsi="Times New Roman" w:cs="Times New Roman"/>
-                <w:sz w:val="28"/>
-                <w:szCs w:val="28"/>
-                <w:lang w:val="en-US"/>
-              </w:rPr>
-              <w:t>5</w:t>
+              <w:t>135</w:t>
             </w:r>
           </w:p>
         </w:tc>
@@ -4433,25 +4415,7 @@
                 <w:szCs w:val="28"/>
                 <w:lang w:val="en-US"/>
               </w:rPr>
-              <w:t>0</w:t>
-            </w:r>
-            <w:r>
-              <w:rPr>
-                <w:rFonts w:ascii="Times New Roman" w:hAnsi="Times New Roman" w:cs="Times New Roman"/>
-                <w:sz w:val="28"/>
-                <w:szCs w:val="28"/>
-                <w:lang w:val="en-US"/>
-              </w:rPr>
-              <w:t>2</w:t>
-            </w:r>
-            <w:r>
-              <w:rPr>
-                <w:rFonts w:ascii="Times New Roman" w:hAnsi="Times New Roman" w:cs="Times New Roman"/>
-                <w:sz w:val="28"/>
-                <w:szCs w:val="28"/>
-                <w:lang w:val="en-US"/>
-              </w:rPr>
-              <w:t>00</w:t>
+              <w:t>0200</w:t>
             </w:r>
           </w:p>
         </w:tc>
@@ -4501,25 +4465,7 @@
                 <w:szCs w:val="28"/>
                 <w:lang w:val="en-US"/>
               </w:rPr>
-              <w:t>0</w:t>
-            </w:r>
-            <w:r>
-              <w:rPr>
-                <w:rFonts w:ascii="Times New Roman" w:hAnsi="Times New Roman" w:cs="Times New Roman"/>
-                <w:sz w:val="28"/>
-                <w:szCs w:val="28"/>
-                <w:lang w:val="en-US"/>
-              </w:rPr>
-              <w:t>2</w:t>
-            </w:r>
-            <w:r>
-              <w:rPr>
-                <w:rFonts w:ascii="Times New Roman" w:hAnsi="Times New Roman" w:cs="Times New Roman"/>
-                <w:sz w:val="28"/>
-                <w:szCs w:val="28"/>
-                <w:lang w:val="en-US"/>
-              </w:rPr>
-              <w:t>00</w:t>
+              <w:t>0200</w:t>
             </w:r>
           </w:p>
         </w:tc>
@@ -7508,6 +7454,7 @@
         <w:docPartUnique/>
       </w:docPartObj>
     </w:sdtPr>
+    <w:sdtEndPr/>
     <w:sdtContent>
       <w:p>
         <w:pPr>

</xml_diff>